<commit_message>
Unit 2 test Day 2: question 1 asks for the number of half-filled orbitals (A-C)
Co-Authored-By: Claude Opus 5.5 <noreply@anthropic.com>
Claude-Session: https://claude.ai/code/session_01LaT1EarAMnh5opQoFahNzN
</commit_message>
<xml_diff>
--- a/output/chem-u02/Unit 2 Test A - Day 2 Written.docx
+++ b/output/chem-u02/Unit 2 Test A - Day 2 Written.docx
@@ -398,7 +398,7 @@
                 <w:sz w:val="19"/>
                 <w:u w:val="none"/>
               </w:rPr>
-              <w:t>Number 1 also needs its orbital diagram.</w:t>
+              <w:t>Number 1 also needs its orbital diagram and the number of half-filled orbitals.</w:t>
             </w:r>
           </w:p>
         </w:tc>
@@ -521,6 +521,7 @@
             <w:pPr>
               <w:tabs>
                 <w:tab w:pos="1800" w:val="left"/>
+                <w:tab w:pos="8352" w:val="right"/>
               </w:tabs>
               <w:spacing w:after="0"/>
               <w:jc w:val="left"/>
@@ -543,6 +544,26 @@
                 <w:u w:val="none"/>
               </w:rPr>
               <w:tab/>
+            </w:r>
+            <w:r>
+              <w:rPr>
+                <w:rFonts w:ascii="Trade Gothic Next" w:hAnsi="Trade Gothic Next"/>
+                <w:b/>
+                <w:color w:val="14161B"/>
+                <w:sz w:val="18"/>
+                <w:u w:val="none"/>
+              </w:rPr>
+              <w:tab/>
+              <w:t>Half-filled orbitals</w:t>
+            </w:r>
+            <w:r>
+              <w:rPr>
+                <w:rFonts w:ascii="Trade Gothic Next" w:hAnsi="Trade Gothic Next"/>
+                <w:b w:val="0"/>
+                <w:sz w:val="18"/>
+                <w:u w:val="none"/>
+              </w:rPr>
+              <w:t xml:space="preserve"> ____ </w:t>
             </w:r>
           </w:p>
         </w:tc>

</xml_diff>

<commit_message>
Unit 2 test Day 2: points shown under each Part 1 question (1 = 4 pts, 2 and 3 = 2 pts)
Co-Authored-By: Claude Opus 5.5 <noreply@anthropic.com>
Claude-Session: https://claude.ai/code/session_01LaT1EarAMnh5opQoFahNzN
</commit_message>
<xml_diff>
--- a/output/chem-u02/Unit 2 Test A - Day 2 Written.docx
+++ b/output/chem-u02/Unit 2 Test A - Day 2 Written.docx
@@ -449,6 +449,21 @@
               <w:t>1</w:t>
             </w:r>
           </w:p>
+          <w:p>
+            <w:pPr>
+              <w:spacing w:after="0"/>
+            </w:pPr>
+            <w:r>
+              <w:rPr>
+                <w:rFonts w:ascii="Trade Gothic Next" w:hAnsi="Trade Gothic Next"/>
+                <w:b/>
+                <w:color w:val="55604F"/>
+                <w:sz w:val="16"/>
+                <w:u w:val="none"/>
+              </w:rPr>
+              <w:t>4 pts</w:t>
+            </w:r>
+          </w:p>
         </w:tc>
         <w:tc>
           <w:tcPr>
@@ -721,6 +736,21 @@
               <w:t>2</w:t>
             </w:r>
           </w:p>
+          <w:p>
+            <w:pPr>
+              <w:spacing w:after="0"/>
+            </w:pPr>
+            <w:r>
+              <w:rPr>
+                <w:rFonts w:ascii="Trade Gothic Next" w:hAnsi="Trade Gothic Next"/>
+                <w:b/>
+                <w:color w:val="55604F"/>
+                <w:sz w:val="16"/>
+                <w:u w:val="none"/>
+              </w:rPr>
+              <w:t>2 pts</w:t>
+            </w:r>
+          </w:p>
         </w:tc>
         <w:tc>
           <w:tcPr>
@@ -872,6 +902,21 @@
                 <w:u w:val="none"/>
               </w:rPr>
               <w:t>3</w:t>
+            </w:r>
+          </w:p>
+          <w:p>
+            <w:pPr>
+              <w:spacing w:after="0"/>
+            </w:pPr>
+            <w:r>
+              <w:rPr>
+                <w:rFonts w:ascii="Trade Gothic Next" w:hAnsi="Trade Gothic Next"/>
+                <w:b/>
+                <w:color w:val="55604F"/>
+                <w:sz w:val="16"/>
+                <w:u w:val="none"/>
+              </w:rPr>
+              <w:t>2 pts</w:t>
             </w:r>
           </w:p>
         </w:tc>

</xml_diff>